<commit_message>
chore: plugin publish cleanup — gitignore, README caveat, DOCX v0.2.1
- .gitignore: add plugin/.ctx-venv/, plugin/hooks/*.py, plugin/scripts/,
  plugin/.install-version (Setup hook uses PyPI, not local copies)
- README: remove stale v0.1 caveat ("hook files not shipped") — resolved in v0.2.1
- docs/research/20260427-ctx-feature-comparison.docx: bump CTX v0.2.0→v0.2.1,
  add "Submitted for Anthropic review" status line

Co-Authored-By: Claude Sonnet 4.6 <noreply@anthropic.com>
</commit_message>
<xml_diff>
--- a/docs/research/20260427-ctx-feature-comparison.docx
+++ b/docs/research/20260427-ctx-feature-comparison.docx
@@ -17,7 +17,7 @@
     </w:p>
     <w:p>
       <w:r>
-        <w:t>Generated 2026-04-27  |  CTX v0.2.0  |  /plugin install ctx@jaytoone</w:t>
+        <w:t>Generated 2026-04-27  |  CTX v0.2.1  |  /plugin install ctx@jaytoone  |  Submitted for Anthropic review</w:t>
       </w:r>
     </w:p>
     <w:p>
@@ -1950,7 +1950,7 @@
               <w:rPr>
                 <w:sz w:val="19"/>
               </w:rPr>
-              <w:t>✓ v0.2.0+</w:t>
+              <w:t>✓ v0.2.1+</w:t>
             </w:r>
           </w:p>
         </w:tc>
@@ -2039,7 +2039,7 @@
               <w:rPr>
                 <w:sz w:val="19"/>
               </w:rPr>
-              <w:t>✓ v0.2.0+</w:t>
+              <w:t>✓ v0.2.1+</w:t>
             </w:r>
           </w:p>
         </w:tc>
@@ -2160,7 +2160,7 @@
         <w:rPr>
           <w:color w:val="2E7D32"/>
         </w:rPr>
-        <w:t>✓ v0.2.0+</w:t>
+        <w:t>✓ v0.2.1+</w:t>
       </w:r>
       <w:r>
         <w:t xml:space="preserve"> = shipped in wheel, auto-deployed by ctx-install</w:t>

</xml_diff>